<commit_message>
Make parser more robust for multi-employee documents
- Remove is_history_table() filter — now scans EVERY table for
  contract and salary sub-sections
- More permissive section detection: uses 'in' keyword matching
  instead of startswith, catches "roostermutaties", variations
  in spacing, etc.
- Better employee name extraction: strips tab+page-number
  suffixes from footer-style paragraphs
- Cleaner section state machine with explicit _detect_section()
- Skip rooster/OE data rows that contain dates (prevent
  false matches)
- Verified against actual Anoniem.docx and 3-employee test doc

https://claude.ai/code/session_01MswAWcFSuTXkVaaCAKKF32
</commit_message>
<xml_diff>
--- a/Anoniem.docx
+++ b/Anoniem.docx
@@ -37,12 +37,6 @@
         <w:tblStyle w:val="TableGrid"/>
         <w:tblW w:w="6033" w:type="dxa"/>
         <w:tblInd w:w="142" w:type="dxa"/>
-        <w:tblCellMar>
-          <w:top w:w="0" w:type="dxa"/>
-          <w:left w:w="0" w:type="dxa"/>
-          <w:bottom w:w="0" w:type="dxa"/>
-          <w:right w:w="0" w:type="dxa"/>
-        </w:tblCellMar>
         <w:tblLook w:val="04A0" w:firstRow="1" w:lastRow="0" w:firstColumn="1" w:lastColumn="0" w:noHBand="0" w:noVBand="1"/>
       </w:tblPr>
       <w:tblGrid>
@@ -153,7 +147,7 @@
           </w:p>
           <w:p>
             <w:pPr>
-              <w:spacing w:after="0" w:line="279" w:lineRule="auto"/>
+              <w:spacing w:line="279" w:lineRule="auto"/>
               <w:ind w:right="606"/>
             </w:pPr>
             <w:proofErr w:type="gramStart"/>
@@ -200,7 +194,6 @@
               <w:tabs>
                 <w:tab w:val="center" w:pos="2361"/>
               </w:tabs>
-              <w:spacing w:after="0"/>
             </w:pPr>
           </w:p>
         </w:tc>
@@ -218,9 +211,6 @@
             <w:pPr>
               <w:spacing w:after="32"/>
               <w:ind w:left="10"/>
-              <w:rPr>
-                <w:lang w:val="en-US"/>
-              </w:rPr>
             </w:pPr>
             <w:r>
               <w:rPr>
@@ -231,19 +221,9 @@
             <w:r>
               <w:rPr>
                 <w:sz w:val="18"/>
-                <w:lang w:val="en-US"/>
-              </w:rPr>
-              <w:t xml:space="preserve"> </w:t>
-            </w:r>
-            <w:proofErr w:type="spellStart"/>
-            <w:r>
-              <w:rPr>
-                <w:sz w:val="18"/>
-                <w:lang w:val="en-US"/>
-              </w:rPr>
-              <w:t>Anonimiseren</w:t>
-            </w:r>
-            <w:proofErr w:type="spellEnd"/>
+              </w:rPr>
+              <w:t xml:space="preserve"> Anonimiseren</w:t>
+            </w:r>
           </w:p>
           <w:p>
             <w:pPr>
@@ -282,7 +262,6 @@
               <w:tabs>
                 <w:tab w:val="center" w:pos="1605"/>
               </w:tabs>
-              <w:spacing w:after="0"/>
             </w:pPr>
             <w:r>
               <w:rPr>
@@ -487,21 +466,7 @@
         <w:rPr>
           <w:sz w:val="18"/>
         </w:rPr>
-        <w:t xml:space="preserve">.  </w:t>
-      </w:r>
-      <w:proofErr w:type="gramStart"/>
-      <w:r>
-        <w:rPr>
-          <w:sz w:val="18"/>
-        </w:rPr>
-        <w:t>eenheid</w:t>
-      </w:r>
-      <w:proofErr w:type="gramEnd"/>
-      <w:r>
-        <w:rPr>
-          <w:sz w:val="18"/>
-        </w:rPr>
-        <w:t>:</w:t>
+        <w:t>.  eenheid:</w:t>
       </w:r>
       <w:r>
         <w:rPr>
@@ -715,12 +680,6 @@
         <w:tblOverlap w:val="never"/>
         <w:tblW w:w="3794" w:type="dxa"/>
         <w:tblInd w:w="0" w:type="dxa"/>
-        <w:tblCellMar>
-          <w:top w:w="0" w:type="dxa"/>
-          <w:left w:w="0" w:type="dxa"/>
-          <w:bottom w:w="0" w:type="dxa"/>
-          <w:right w:w="0" w:type="dxa"/>
-        </w:tblCellMar>
         <w:tblLook w:val="04A0" w:firstRow="1" w:lastRow="0" w:firstColumn="1" w:lastColumn="0" w:noHBand="0" w:noVBand="1"/>
       </w:tblPr>
       <w:tblGrid>
@@ -779,7 +738,6 @@
           </w:p>
           <w:p>
             <w:pPr>
-              <w:spacing w:after="0"/>
               <w:ind w:left="142"/>
             </w:pPr>
             <w:r>
@@ -835,9 +793,6 @@
             </w:r>
           </w:p>
           <w:p>
-            <w:pPr>
-              <w:spacing w:after="0"/>
-            </w:pPr>
             <w:r>
               <w:rPr>
                 <w:sz w:val="18"/>
@@ -874,9 +829,6 @@
             </w:r>
           </w:p>
           <w:p>
-            <w:pPr>
-              <w:spacing w:after="0"/>
-            </w:pPr>
             <w:r>
               <w:rPr>
                 <w:sz w:val="20"/>
@@ -896,9 +848,6 @@
             </w:tcBorders>
           </w:tcPr>
           <w:p>
-            <w:pPr>
-              <w:spacing w:after="0"/>
-            </w:pPr>
             <w:r>
               <w:rPr>
                 <w:sz w:val="18"/>
@@ -984,7 +933,6 @@
           </w:p>
           <w:p>
             <w:pPr>
-              <w:spacing w:after="0"/>
               <w:ind w:left="142"/>
             </w:pPr>
             <w:r>
@@ -1040,9 +988,6 @@
             </w:r>
           </w:p>
           <w:p>
-            <w:pPr>
-              <w:spacing w:after="0"/>
-            </w:pPr>
             <w:r>
               <w:rPr>
                 <w:sz w:val="18"/>
@@ -1081,12 +1026,6 @@
         <w:tblOverlap w:val="never"/>
         <w:tblW w:w="9350" w:type="dxa"/>
         <w:tblInd w:w="0" w:type="dxa"/>
-        <w:tblCellMar>
-          <w:top w:w="0" w:type="dxa"/>
-          <w:left w:w="0" w:type="dxa"/>
-          <w:bottom w:w="0" w:type="dxa"/>
-          <w:right w:w="0" w:type="dxa"/>
-        </w:tblCellMar>
         <w:tblLook w:val="04A0" w:firstRow="1" w:lastRow="0" w:firstColumn="1" w:lastColumn="0" w:noHBand="0" w:noVBand="1"/>
       </w:tblPr>
       <w:tblGrid>
@@ -1117,7 +1056,6 @@
               <w:tabs>
                 <w:tab w:val="center" w:pos="2983"/>
               </w:tabs>
-              <w:spacing w:after="0"/>
             </w:pPr>
             <w:r>
               <w:rPr>
@@ -1147,10 +1085,6 @@
             </w:tcBorders>
           </w:tcPr>
           <w:p>
-            <w:pPr>
-              <w:spacing w:after="0"/>
-            </w:pPr>
-            <w:proofErr w:type="gramStart"/>
             <w:r>
               <w:rPr>
                 <w:color w:val="0064AF"/>
@@ -1158,7 +1092,6 @@
               </w:rPr>
               <w:t>Eind contract</w:t>
             </w:r>
-            <w:proofErr w:type="gramEnd"/>
           </w:p>
         </w:tc>
         <w:tc>
@@ -1172,9 +1105,6 @@
             </w:tcBorders>
           </w:tcPr>
           <w:p>
-            <w:pPr>
-              <w:spacing w:after="0"/>
-            </w:pPr>
             <w:r>
               <w:rPr>
                 <w:color w:val="0064AF"/>
@@ -1195,9 +1125,6 @@
             </w:tcBorders>
           </w:tcPr>
           <w:p>
-            <w:pPr>
-              <w:spacing w:after="0"/>
-            </w:pPr>
             <w:r>
               <w:rPr>
                 <w:color w:val="0064AF"/>
@@ -1219,7 +1146,6 @@
           </w:tcPr>
           <w:p>
             <w:pPr>
-              <w:spacing w:after="0"/>
               <w:jc w:val="both"/>
             </w:pPr>
             <w:r>
@@ -1249,7 +1175,6 @@
           </w:tcPr>
           <w:p>
             <w:pPr>
-              <w:spacing w:after="0"/>
               <w:ind w:left="152"/>
             </w:pPr>
             <w:r>
@@ -1270,7 +1195,14 @@
               <w:rPr>
                 <w:sz w:val="18"/>
               </w:rPr>
-              <w:t xml:space="preserve"> Netherlands01-03-2026</w:t>
+              <w:t xml:space="preserve"> Netherlands</w:t>
+            </w:r>
+            <w:r>
+              <w:rPr>
+                <w:sz w:val="18"/>
+                <w:highlight w:val="yellow"/>
+              </w:rPr>
+              <w:t>01-03-2026</w:t>
             </w:r>
           </w:p>
         </w:tc>
@@ -1286,12 +1218,15 @@
           </w:tcPr>
           <w:p>
             <w:pPr>
-              <w:spacing w:after="0"/>
               <w:ind w:left="10"/>
-            </w:pPr>
-            <w:r>
-              <w:rPr>
-                <w:sz w:val="18"/>
+              <w:rPr>
+                <w:highlight w:val="yellow"/>
+              </w:rPr>
+            </w:pPr>
+            <w:r>
+              <w:rPr>
+                <w:sz w:val="18"/>
+                <w:highlight w:val="yellow"/>
               </w:rPr>
               <w:t>28-02-2027</w:t>
             </w:r>
@@ -1309,12 +1244,15 @@
           </w:tcPr>
           <w:p>
             <w:pPr>
-              <w:spacing w:after="0"/>
               <w:ind w:left="10"/>
-            </w:pPr>
-            <w:r>
-              <w:rPr>
-                <w:sz w:val="18"/>
+              <w:rPr>
+                <w:highlight w:val="yellow"/>
+              </w:rPr>
+            </w:pPr>
+            <w:r>
+              <w:rPr>
+                <w:sz w:val="18"/>
+                <w:highlight w:val="yellow"/>
               </w:rPr>
               <w:t>Jaarcontract</w:t>
             </w:r>
@@ -1332,7 +1270,6 @@
           </w:tcPr>
           <w:p>
             <w:pPr>
-              <w:spacing w:after="0"/>
               <w:ind w:left="10"/>
             </w:pPr>
             <w:r>
@@ -1355,7 +1292,6 @@
           </w:tcPr>
           <w:p>
             <w:pPr>
-              <w:spacing w:after="0"/>
               <w:ind w:left="10"/>
             </w:pPr>
             <w:r>
@@ -1384,7 +1320,6 @@
           </w:tcPr>
           <w:p>
             <w:pPr>
-              <w:spacing w:after="0"/>
               <w:ind w:left="152"/>
             </w:pPr>
             <w:r>
@@ -1405,7 +1340,14 @@
               <w:rPr>
                 <w:sz w:val="18"/>
               </w:rPr>
-              <w:t xml:space="preserve"> Netherlands01-09-2025</w:t>
+              <w:t xml:space="preserve"> Netherlands</w:t>
+            </w:r>
+            <w:r>
+              <w:rPr>
+                <w:sz w:val="18"/>
+                <w:highlight w:val="yellow"/>
+              </w:rPr>
+              <w:t>01-09-2025</w:t>
             </w:r>
           </w:p>
         </w:tc>
@@ -1422,12 +1364,15 @@
           </w:tcPr>
           <w:p>
             <w:pPr>
-              <w:spacing w:after="0"/>
               <w:ind w:left="10"/>
-            </w:pPr>
-            <w:r>
-              <w:rPr>
-                <w:sz w:val="18"/>
+              <w:rPr>
+                <w:highlight w:val="yellow"/>
+              </w:rPr>
+            </w:pPr>
+            <w:r>
+              <w:rPr>
+                <w:sz w:val="18"/>
+                <w:highlight w:val="yellow"/>
               </w:rPr>
               <w:t>28-02-2026</w:t>
             </w:r>
@@ -1446,12 +1391,15 @@
           </w:tcPr>
           <w:p>
             <w:pPr>
-              <w:spacing w:after="0"/>
               <w:ind w:left="10"/>
-            </w:pPr>
-            <w:r>
-              <w:rPr>
-                <w:sz w:val="18"/>
+              <w:rPr>
+                <w:highlight w:val="yellow"/>
+              </w:rPr>
+            </w:pPr>
+            <w:r>
+              <w:rPr>
+                <w:sz w:val="18"/>
+                <w:highlight w:val="yellow"/>
               </w:rPr>
               <w:t>Halfjaarcontract</w:t>
             </w:r>
@@ -1470,7 +1418,6 @@
           </w:tcPr>
           <w:p>
             <w:pPr>
-              <w:spacing w:after="0"/>
               <w:ind w:left="10"/>
             </w:pPr>
             <w:r>
@@ -1494,7 +1441,6 @@
           </w:tcPr>
           <w:p>
             <w:pPr>
-              <w:spacing w:after="0"/>
               <w:ind w:left="10"/>
             </w:pPr>
             <w:r>
@@ -1521,9 +1467,6 @@
             </w:tcBorders>
           </w:tcPr>
           <w:p>
-            <w:pPr>
-              <w:spacing w:after="0"/>
-            </w:pPr>
             <w:r>
               <w:rPr>
                 <w:sz w:val="20"/>
@@ -1616,7 +1559,6 @@
               <w:tabs>
                 <w:tab w:val="center" w:pos="1704"/>
               </w:tabs>
-              <w:spacing w:after="0"/>
             </w:pPr>
             <w:r>
               <w:rPr>
@@ -1646,9 +1588,6 @@
             </w:tcBorders>
           </w:tcPr>
           <w:p>
-            <w:pPr>
-              <w:spacing w:after="0"/>
-            </w:pPr>
             <w:r>
               <w:rPr>
                 <w:color w:val="0064AF"/>
@@ -1669,9 +1608,6 @@
             </w:tcBorders>
           </w:tcPr>
           <w:p>
-            <w:pPr>
-              <w:spacing w:after="0"/>
-            </w:pPr>
             <w:r>
               <w:rPr>
                 <w:color w:val="0064AF"/>
@@ -1692,9 +1628,6 @@
             </w:tcBorders>
           </w:tcPr>
           <w:p>
-            <w:pPr>
-              <w:spacing w:after="0"/>
-            </w:pPr>
             <w:r>
               <w:rPr>
                 <w:color w:val="0064AF"/>
@@ -1748,7 +1681,6 @@
               <w:tabs>
                 <w:tab w:val="center" w:pos="1746"/>
               </w:tabs>
-              <w:spacing w:after="0"/>
             </w:pPr>
             <w:r>
               <w:rPr>
@@ -1777,7 +1709,6 @@
           </w:tcPr>
           <w:p>
             <w:pPr>
-              <w:spacing w:after="0"/>
               <w:ind w:left="10"/>
             </w:pPr>
             <w:r>
@@ -1800,7 +1731,6 @@
           </w:tcPr>
           <w:p>
             <w:pPr>
-              <w:spacing w:after="0"/>
               <w:ind w:left="10"/>
             </w:pPr>
             <w:r>
@@ -1823,7 +1753,6 @@
           </w:tcPr>
           <w:p>
             <w:pPr>
-              <w:spacing w:after="0"/>
               <w:ind w:left="10"/>
             </w:pPr>
             <w:r>
@@ -1878,7 +1807,6 @@
               <w:tabs>
                 <w:tab w:val="center" w:pos="1746"/>
               </w:tabs>
-              <w:spacing w:after="0"/>
             </w:pPr>
             <w:r>
               <w:rPr>
@@ -1907,7 +1835,6 @@
           </w:tcPr>
           <w:p>
             <w:pPr>
-              <w:spacing w:after="0"/>
               <w:ind w:left="10"/>
             </w:pPr>
             <w:r>
@@ -1930,7 +1857,6 @@
           </w:tcPr>
           <w:p>
             <w:pPr>
-              <w:spacing w:after="0"/>
               <w:ind w:left="10"/>
             </w:pPr>
             <w:r>
@@ -1953,7 +1879,6 @@
           </w:tcPr>
           <w:p>
             <w:pPr>
-              <w:spacing w:after="0"/>
               <w:ind w:left="10"/>
             </w:pPr>
             <w:r>
@@ -2005,7 +1930,6 @@
           </w:tcPr>
           <w:p>
             <w:pPr>
-              <w:spacing w:after="0"/>
               <w:ind w:left="142" w:hanging="142"/>
             </w:pPr>
             <w:r>
@@ -2043,11 +1967,7 @@
             <w:vAlign w:val="bottom"/>
           </w:tcPr>
           <w:p>
-            <w:pPr>
-              <w:spacing w:after="0"/>
-            </w:pPr>
             <w:proofErr w:type="spellStart"/>
-            <w:proofErr w:type="gramStart"/>
             <w:r>
               <w:rPr>
                 <w:color w:val="0064AF"/>
@@ -2063,7 +1983,6 @@
               </w:rPr>
               <w:t xml:space="preserve">  eenheid</w:t>
             </w:r>
-            <w:proofErr w:type="gramEnd"/>
           </w:p>
         </w:tc>
         <w:tc>
@@ -2079,7 +1998,6 @@
           </w:tcPr>
           <w:p>
             <w:pPr>
-              <w:spacing w:after="0"/>
               <w:ind w:left="1"/>
             </w:pPr>
             <w:r>
@@ -2147,7 +2065,6 @@
               <w:tabs>
                 <w:tab w:val="center" w:pos="1746"/>
               </w:tabs>
-              <w:spacing w:after="0"/>
             </w:pPr>
             <w:r>
               <w:rPr>
@@ -2176,7 +2093,6 @@
           </w:tcPr>
           <w:p>
             <w:pPr>
-              <w:spacing w:after="0"/>
               <w:ind w:left="10"/>
             </w:pPr>
             <w:r>
@@ -2199,7 +2115,6 @@
           </w:tcPr>
           <w:p>
             <w:pPr>
-              <w:spacing w:after="0"/>
               <w:ind w:left="11"/>
             </w:pPr>
             <w:r>
@@ -2266,7 +2181,6 @@
               <w:tabs>
                 <w:tab w:val="center" w:pos="1746"/>
               </w:tabs>
-              <w:spacing w:after="0"/>
             </w:pPr>
             <w:r>
               <w:rPr>
@@ -2295,7 +2209,6 @@
           </w:tcPr>
           <w:p>
             <w:pPr>
-              <w:spacing w:after="0"/>
               <w:ind w:left="10"/>
             </w:pPr>
             <w:r>
@@ -2318,7 +2231,6 @@
           </w:tcPr>
           <w:p>
             <w:pPr>
-              <w:spacing w:after="0"/>
               <w:ind w:left="11"/>
             </w:pPr>
             <w:r>
@@ -2382,22 +2294,13 @@
           </w:tcPr>
           <w:p>
             <w:pPr>
-              <w:spacing w:after="0"/>
               <w:ind w:left="142" w:hanging="142"/>
             </w:pPr>
-            <w:proofErr w:type="gramStart"/>
             <w:r>
               <w:rPr>
                 <w:sz w:val="20"/>
               </w:rPr>
-              <w:t>Salaris mutaties</w:t>
-            </w:r>
-            <w:proofErr w:type="gramEnd"/>
-            <w:r>
-              <w:rPr>
-                <w:sz w:val="20"/>
-              </w:rPr>
-              <w:t xml:space="preserve"> </w:t>
+              <w:t xml:space="preserve">Salaris mutaties </w:t>
             </w:r>
             <w:r>
               <w:rPr>
@@ -2428,9 +2331,6 @@
             <w:vAlign w:val="bottom"/>
           </w:tcPr>
           <w:p>
-            <w:pPr>
-              <w:spacing w:after="0"/>
-            </w:pPr>
             <w:r>
               <w:rPr>
                 <w:color w:val="0064AF"/>
@@ -2452,9 +2352,6 @@
             <w:vAlign w:val="bottom"/>
           </w:tcPr>
           <w:p>
-            <w:pPr>
-              <w:spacing w:after="0"/>
-            </w:pPr>
             <w:r>
               <w:rPr>
                 <w:color w:val="0064AF"/>
@@ -2476,9 +2373,6 @@
             <w:vAlign w:val="bottom"/>
           </w:tcPr>
           <w:p>
-            <w:pPr>
-              <w:spacing w:after="0"/>
-            </w:pPr>
             <w:r>
               <w:rPr>
                 <w:color w:val="0064AF"/>
@@ -2532,17 +2426,21 @@
               <w:tabs>
                 <w:tab w:val="center" w:pos="1746"/>
               </w:tabs>
-              <w:spacing w:after="0"/>
-            </w:pPr>
-            <w:r>
-              <w:rPr>
-                <w:sz w:val="18"/>
+              <w:rPr>
+                <w:highlight w:val="yellow"/>
+              </w:rPr>
+            </w:pPr>
+            <w:r>
+              <w:rPr>
+                <w:sz w:val="18"/>
+                <w:highlight w:val="yellow"/>
               </w:rPr>
               <w:t>01-03-2026</w:t>
             </w:r>
             <w:r>
               <w:rPr>
                 <w:sz w:val="18"/>
+                <w:highlight w:val="yellow"/>
               </w:rPr>
               <w:tab/>
               <w:t>28-02-2027</w:t>
@@ -2561,12 +2459,15 @@
           </w:tcPr>
           <w:p>
             <w:pPr>
-              <w:spacing w:after="0"/>
               <w:ind w:left="10"/>
-            </w:pPr>
-            <w:r>
-              <w:rPr>
-                <w:sz w:val="18"/>
+              <w:rPr>
+                <w:highlight w:val="yellow"/>
+              </w:rPr>
+            </w:pPr>
+            <w:r>
+              <w:rPr>
+                <w:sz w:val="18"/>
+                <w:highlight w:val="yellow"/>
               </w:rPr>
               <w:t>2.623,53</w:t>
             </w:r>
@@ -2584,7 +2485,6 @@
           </w:tcPr>
           <w:p>
             <w:pPr>
-              <w:spacing w:after="0"/>
               <w:ind w:left="10"/>
             </w:pPr>
             <w:r>
@@ -2651,17 +2551,21 @@
               <w:tabs>
                 <w:tab w:val="center" w:pos="1746"/>
               </w:tabs>
-              <w:spacing w:after="0"/>
-            </w:pPr>
-            <w:r>
-              <w:rPr>
-                <w:sz w:val="18"/>
+              <w:rPr>
+                <w:highlight w:val="yellow"/>
+              </w:rPr>
+            </w:pPr>
+            <w:r>
+              <w:rPr>
+                <w:sz w:val="18"/>
+                <w:highlight w:val="yellow"/>
               </w:rPr>
               <w:t>01-01-2026</w:t>
             </w:r>
             <w:r>
               <w:rPr>
                 <w:sz w:val="18"/>
+                <w:highlight w:val="yellow"/>
               </w:rPr>
               <w:tab/>
               <w:t>28-02-2026</w:t>
@@ -2680,12 +2584,15 @@
           </w:tcPr>
           <w:p>
             <w:pPr>
-              <w:spacing w:after="0"/>
               <w:ind w:left="10"/>
-            </w:pPr>
-            <w:r>
-              <w:rPr>
-                <w:sz w:val="18"/>
+              <w:rPr>
+                <w:highlight w:val="yellow"/>
+              </w:rPr>
+            </w:pPr>
+            <w:r>
+              <w:rPr>
+                <w:sz w:val="18"/>
+                <w:highlight w:val="yellow"/>
               </w:rPr>
               <w:t>2.623,53</w:t>
             </w:r>
@@ -2703,7 +2610,6 @@
           </w:tcPr>
           <w:p>
             <w:pPr>
-              <w:spacing w:after="0"/>
               <w:ind w:left="10"/>
             </w:pPr>
             <w:r>
@@ -2770,17 +2676,21 @@
               <w:tabs>
                 <w:tab w:val="center" w:pos="1746"/>
               </w:tabs>
-              <w:spacing w:after="0"/>
-            </w:pPr>
-            <w:r>
-              <w:rPr>
-                <w:sz w:val="18"/>
+              <w:rPr>
+                <w:highlight w:val="yellow"/>
+              </w:rPr>
+            </w:pPr>
+            <w:r>
+              <w:rPr>
+                <w:sz w:val="18"/>
+                <w:highlight w:val="yellow"/>
               </w:rPr>
               <w:t>01-09-2025</w:t>
             </w:r>
             <w:r>
               <w:rPr>
                 <w:sz w:val="18"/>
+                <w:highlight w:val="yellow"/>
               </w:rPr>
               <w:tab/>
               <w:t>31-12-2025</w:t>
@@ -2799,12 +2709,15 @@
           </w:tcPr>
           <w:p>
             <w:pPr>
-              <w:spacing w:after="0"/>
               <w:ind w:left="10"/>
-            </w:pPr>
-            <w:r>
-              <w:rPr>
-                <w:sz w:val="18"/>
+              <w:rPr>
+                <w:highlight w:val="yellow"/>
+              </w:rPr>
+            </w:pPr>
+            <w:r>
+              <w:rPr>
+                <w:sz w:val="18"/>
+                <w:highlight w:val="yellow"/>
               </w:rPr>
               <w:t>2.505,60</w:t>
             </w:r>
@@ -2822,7 +2735,6 @@
           </w:tcPr>
           <w:p>
             <w:pPr>
-              <w:spacing w:after="0"/>
               <w:ind w:left="10"/>
             </w:pPr>
             <w:r>
@@ -2880,7 +2792,6 @@
         <w:rPr>
           <w:noProof/>
         </w:rPr>
-        <w:lastRenderedPageBreak/>
         <mc:AlternateContent>
           <mc:Choice Requires="wpg">
             <w:drawing>
@@ -3550,6 +3461,7 @@
         <w:ind w:left="152"/>
       </w:pPr>
       <w:r>
+        <w:lastRenderedPageBreak/>
         <w:t>Verlofsaldi (dagen/uren)</w:t>
       </w:r>
     </w:p>
@@ -4701,122 +4613,119 @@
               </wp:inline>
             </w:drawing>
           </mc:Choice>
-          <mc:Fallback xmlns:a="http://schemas.openxmlformats.org/drawingml/2006/main">
+          <mc:Fallback>
             <w:pict>
-              <v:group id="Group 2173" style="width:496.005pt;height:12.1119pt;mso-position-horizontal-relative:char;mso-position-vertical-relative:line" coordsize="62992,1538">
-                <v:shape id="Shape 231" style="position:absolute;width:62992;height:0;left:0;top:45;" coordsize="6299264,0" path="m6299264,0l0,0">
-                  <v:stroke weight="0.5pt" endcap="flat" joinstyle="miter" miterlimit="10" on="true" color="#c0c0c0"/>
-                  <v:fill on="false" color="#000000" opacity="0"/>
+              <v:group w14:anchorId="0BABCD69" id="Group 2173" o:spid="_x0000_s1026" style="width:496pt;height:12.1pt;mso-position-horizontal-relative:char;mso-position-vertical-relative:line" coordsize="62992,1538" o:gfxdata="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">
+                <v:shape id="Shape 231" o:spid="_x0000_s1027" style="position:absolute;top:45;width:62992;height:0;visibility:visible;mso-wrap-style:square;v-text-anchor:top" coordsize="6299264,0" o:gfxdata="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" path="m6299264,l,e" filled="f" strokecolor="silver" strokeweight=".5pt">
+                  <v:stroke miterlimit="83231f" joinstyle="miter"/>
+                  <v:path arrowok="t" textboxrect="0,0,6299264,0"/>
                 </v:shape>
-                <v:rect id="Rectangle 234" style="position:absolute;width:16589;height:2021;left:254;top:0;" filled="f" stroked="f">
+                <v:rect id="Rectangle 234" o:spid="_x0000_s1028" style="position:absolute;left:254;width:16589;height:2021;visibility:visible;mso-wrap-style:square;v-text-anchor:top" o:gfxdata="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" filled="f" stroked="f">
                   <v:textbox inset="0,0,0,0">
                     <w:txbxContent>
                       <w:p>
-                        <w:pPr>
-                          <w:spacing w:before="0" w:after="160" w:line="259" w:lineRule="auto"/>
-                        </w:pPr>
                         <w:r>
                           <w:rPr>
-                            <w:rFonts w:cs="Calibri" w:hAnsi="Calibri" w:eastAsia="Calibri" w:ascii="Calibri"/>
                             <w:w w:val="108"/>
                             <w:sz w:val="18"/>
                           </w:rPr>
-                          <w:t xml:space="preserve">Ferrari</w:t>
+                          <w:t>Ferrari</w:t>
                         </w:r>
                         <w:r>
                           <w:rPr>
-                            <w:rFonts w:cs="Calibri" w:hAnsi="Calibri" w:eastAsia="Calibri" w:ascii="Calibri"/>
                             <w:spacing w:val="8"/>
                             <w:w w:val="108"/>
                             <w:sz w:val="18"/>
                           </w:rPr>
                           <w:t xml:space="preserve"> </w:t>
                         </w:r>
+                        <w:proofErr w:type="spellStart"/>
                         <w:r>
                           <w:rPr>
-                            <w:rFonts w:cs="Calibri" w:hAnsi="Calibri" w:eastAsia="Calibri" w:ascii="Calibri"/>
                             <w:w w:val="108"/>
                             <w:sz w:val="18"/>
                           </w:rPr>
-                          <w:t xml:space="preserve">Logistics</w:t>
+                          <w:t>Logistics</w:t>
                         </w:r>
+                        <w:proofErr w:type="spellEnd"/>
                         <w:r>
                           <w:rPr>
-                            <w:rFonts w:cs="Calibri" w:hAnsi="Calibri" w:eastAsia="Calibri" w:ascii="Calibri"/>
                             <w:spacing w:val="8"/>
                             <w:w w:val="108"/>
                             <w:sz w:val="18"/>
                           </w:rPr>
                           <w:t xml:space="preserve"> </w:t>
                         </w:r>
+                        <w:proofErr w:type="spellStart"/>
                         <w:r>
                           <w:rPr>
-                            <w:rFonts w:cs="Calibri" w:hAnsi="Calibri" w:eastAsia="Calibri" w:ascii="Calibri"/>
                             <w:w w:val="108"/>
                             <w:sz w:val="18"/>
                           </w:rPr>
-                          <w:t xml:space="preserve">Netherla</w:t>
+                          <w:t>Netherla</w:t>
                         </w:r>
+                        <w:proofErr w:type="spellEnd"/>
                       </w:p>
                     </w:txbxContent>
                   </v:textbox>
                 </v:rect>
-                <v:shape id="Shape 235" style="position:absolute;width:1143;height:0;left:51542;top:395;" coordsize="114300,0" path="m0,0l114300,0">
-                  <v:stroke weight="1pt" endcap="flat" joinstyle="miter" miterlimit="10" on="true" color="#000000"/>
-                  <v:fill on="false" color="#000000" opacity="0"/>
+                <v:shape id="Shape 235" o:spid="_x0000_s1029" style="position:absolute;left:51542;top:395;width:1143;height:0;visibility:visible;mso-wrap-style:square;v-text-anchor:top" coordsize="114300,0" o:gfxdata="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" path="m,l114300,e" filled="f" strokeweight="1pt">
+                  <v:stroke miterlimit="83231f" joinstyle="miter"/>
+                  <v:path arrowok="t" textboxrect="0,0,114300,0"/>
                 </v:shape>
-                <v:shape id="Shape 236" style="position:absolute;width:0;height:1143;left:52685;top:395;" coordsize="0,114300" path="m0,0l0,114300">
-                  <v:stroke weight="1pt" endcap="flat" joinstyle="miter" miterlimit="10" on="true" color="#000000"/>
-                  <v:fill on="false" color="#000000" opacity="0"/>
+                <v:shape id="Shape 236" o:spid="_x0000_s1030" style="position:absolute;left:52685;top:395;width:0;height:1143;visibility:visible;mso-wrap-style:square;v-text-anchor:top" coordsize="0,114300" o:gfxdata="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" path="m,l,114300e" filled="f" strokeweight="1pt">
+                  <v:stroke miterlimit="83231f" joinstyle="miter"/>
+                  <v:path arrowok="t" textboxrect="0,0,0,114300"/>
                 </v:shape>
-                <v:shape id="Shape 237" style="position:absolute;width:1143;height:0;left:51542;top:1538;" coordsize="114300,0" path="m114300,0l0,0">
-                  <v:stroke weight="1pt" endcap="flat" joinstyle="miter" miterlimit="10" on="true" color="#000000"/>
-                  <v:fill on="false" color="#000000" opacity="0"/>
+                <v:shape id="Shape 237" o:spid="_x0000_s1031" style="position:absolute;left:51542;top:1538;width:1143;height:0;visibility:visible;mso-wrap-style:square;v-text-anchor:top" coordsize="114300,0" o:gfxdata="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" path="m114300,l,e" filled="f" strokeweight="1pt">
+                  <v:stroke miterlimit="83231f" joinstyle="miter"/>
+                  <v:path arrowok="t" textboxrect="0,0,114300,0"/>
                 </v:shape>
-                <v:shape id="Shape 238" style="position:absolute;width:0;height:1143;left:51542;top:395;" coordsize="0,114300" path="m0,114300l0,0">
-                  <v:stroke weight="1pt" endcap="flat" joinstyle="miter" miterlimit="10" on="true" color="#000000"/>
-                  <v:fill on="false" color="#000000" opacity="0"/>
+                <v:shape id="Shape 238" o:spid="_x0000_s1032" style="position:absolute;left:51542;top:395;width:0;height:1143;visibility:visible;mso-wrap-style:square;v-text-anchor:top" coordsize="0,114300" o:gfxdata="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" path="m,114300l,e" filled="f" strokeweight="1pt">
+                  <v:stroke miterlimit="83231f" joinstyle="miter"/>
+                  <v:path arrowok="t" textboxrect="0,0,0,114300"/>
                 </v:shape>
-                <v:shape id="Shape 239" style="position:absolute;width:1143;height:0;left:55638;top:395;" coordsize="114300,0" path="m0,0l114300,0">
-                  <v:stroke weight="1pt" endcap="flat" joinstyle="miter" miterlimit="10" on="true" color="#000000"/>
-                  <v:fill on="false" color="#000000" opacity="0"/>
+                <v:shape id="Shape 239" o:spid="_x0000_s1033" style="position:absolute;left:55638;top:395;width:1143;height:0;visibility:visible;mso-wrap-style:square;v-text-anchor:top" coordsize="114300,0" o:gfxdata="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" path="m,l114300,e" filled="f" strokeweight="1pt">
+                  <v:stroke miterlimit="83231f" joinstyle="miter"/>
+                  <v:path arrowok="t" textboxrect="0,0,114300,0"/>
                 </v:shape>
-                <v:shape id="Shape 240" style="position:absolute;width:0;height:1143;left:56781;top:395;" coordsize="0,114300" path="m0,0l0,114300">
-                  <v:stroke weight="1pt" endcap="flat" joinstyle="miter" miterlimit="10" on="true" color="#000000"/>
-                  <v:fill on="false" color="#000000" opacity="0"/>
+                <v:shape id="Shape 240" o:spid="_x0000_s1034" style="position:absolute;left:56781;top:395;width:0;height:1143;visibility:visible;mso-wrap-style:square;v-text-anchor:top" coordsize="0,114300" o:gfxdata="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" path="m,l,114300e" filled="f" strokeweight="1pt">
+                  <v:stroke miterlimit="83231f" joinstyle="miter"/>
+                  <v:path arrowok="t" textboxrect="0,0,0,114300"/>
                 </v:shape>
-                <v:shape id="Shape 241" style="position:absolute;width:1143;height:0;left:55638;top:1538;" coordsize="114300,0" path="m114300,0l0,0">
-                  <v:stroke weight="1pt" endcap="flat" joinstyle="miter" miterlimit="10" on="true" color="#000000"/>
-                  <v:fill on="false" color="#000000" opacity="0"/>
+                <v:shape id="Shape 241" o:spid="_x0000_s1035" style="position:absolute;left:55638;top:1538;width:1143;height:0;visibility:visible;mso-wrap-style:square;v-text-anchor:top" coordsize="114300,0" o:gfxdata="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" path="m114300,l,e" filled="f" strokeweight="1pt">
+                  <v:stroke miterlimit="83231f" joinstyle="miter"/>
+                  <v:path arrowok="t" textboxrect="0,0,114300,0"/>
                 </v:shape>
-                <v:shape id="Shape 242" style="position:absolute;width:0;height:1143;left:55638;top:395;" coordsize="0,114300" path="m0,114300l0,0">
-                  <v:stroke weight="1pt" endcap="flat" joinstyle="miter" miterlimit="10" on="true" color="#000000"/>
-                  <v:fill on="false" color="#000000" opacity="0"/>
+                <v:shape id="Shape 242" o:spid="_x0000_s1036" style="position:absolute;left:55638;top:395;width:0;height:1143;visibility:visible;mso-wrap-style:square;v-text-anchor:top" coordsize="0,114300" o:gfxdata="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" path="m,114300l,e" filled="f" strokeweight="1pt">
+                  <v:stroke miterlimit="83231f" joinstyle="miter"/>
+                  <v:path arrowok="t" textboxrect="0,0,0,114300"/>
                 </v:shape>
-                <v:shape id="Shape 243" style="position:absolute;width:190;height:190;left:55829;top:1061;" coordsize="19050,19050" path="m0,0l19050,19050">
-                  <v:stroke weight="1.5pt" endcap="flat" joinstyle="miter" miterlimit="10" on="true" color="#000000"/>
-                  <v:fill on="false" color="#000000" opacity="0"/>
+                <v:shape id="Shape 243" o:spid="_x0000_s1037" style="position:absolute;left:55829;top:1061;width:190;height:191;visibility:visible;mso-wrap-style:square;v-text-anchor:top" coordsize="19050,19050" o:gfxdata="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" path="m,l19050,19050e" filled="f" strokeweight="1.5pt">
+                  <v:stroke miterlimit="83231f" joinstyle="miter"/>
+                  <v:path arrowok="t" textboxrect="0,0,19050,19050"/>
                 </v:shape>
-                <v:shape id="Shape 244" style="position:absolute;width:571;height:571;left:56019;top:680;" coordsize="57150,57150" path="m0,57150l57150,0">
-                  <v:stroke weight="1.5pt" endcap="flat" joinstyle="miter" miterlimit="10" on="true" color="#000000"/>
-                  <v:fill on="false" color="#000000" opacity="0"/>
+                <v:shape id="Shape 244" o:spid="_x0000_s1038" style="position:absolute;left:56019;top:680;width:572;height:572;visibility:visible;mso-wrap-style:square;v-text-anchor:top" coordsize="57150,57150" o:gfxdata="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" path="m,57150l57150,e" filled="f" strokeweight="1.5pt">
+                  <v:stroke miterlimit="83231f" joinstyle="miter"/>
+                  <v:path arrowok="t" textboxrect="0,0,57150,57150"/>
                 </v:shape>
-                <v:shape id="Shape 245" style="position:absolute;width:1143;height:0;left:47066;top:395;" coordsize="114300,0" path="m0,0l114300,0">
-                  <v:stroke weight="1pt" endcap="flat" joinstyle="miter" miterlimit="10" on="true" color="#000000"/>
-                  <v:fill on="false" color="#000000" opacity="0"/>
+                <v:shape id="Shape 245" o:spid="_x0000_s1039" style="position:absolute;left:47066;top:395;width:1143;height:0;visibility:visible;mso-wrap-style:square;v-text-anchor:top" coordsize="114300,0" o:gfxdata="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" path="m,l114300,e" filled="f" strokeweight="1pt">
+                  <v:stroke miterlimit="83231f" joinstyle="miter"/>
+                  <v:path arrowok="t" textboxrect="0,0,114300,0"/>
                 </v:shape>
-                <v:shape id="Shape 246" style="position:absolute;width:0;height:1143;left:48209;top:395;" coordsize="0,114300" path="m0,0l0,114300">
-                  <v:stroke weight="1pt" endcap="flat" joinstyle="miter" miterlimit="10" on="true" color="#000000"/>
-                  <v:fill on="false" color="#000000" opacity="0"/>
+                <v:shape id="Shape 246" o:spid="_x0000_s1040" style="position:absolute;left:48209;top:395;width:0;height:1143;visibility:visible;mso-wrap-style:square;v-text-anchor:top" coordsize="0,114300" o:gfxdata="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" path="m,l,114300e" filled="f" strokeweight="1pt">
+                  <v:stroke miterlimit="83231f" joinstyle="miter"/>
+                  <v:path arrowok="t" textboxrect="0,0,0,114300"/>
                 </v:shape>
-                <v:shape id="Shape 247" style="position:absolute;width:1143;height:0;left:47066;top:1538;" coordsize="114300,0" path="m114300,0l0,0">
-                  <v:stroke weight="1pt" endcap="flat" joinstyle="miter" miterlimit="10" on="true" color="#000000"/>
-                  <v:fill on="false" color="#000000" opacity="0"/>
+                <v:shape id="Shape 247" o:spid="_x0000_s1041" style="position:absolute;left:47066;top:1538;width:1143;height:0;visibility:visible;mso-wrap-style:square;v-text-anchor:top" coordsize="114300,0" o:gfxdata="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" path="m114300,l,e" filled="f" strokeweight="1pt">
+                  <v:stroke miterlimit="83231f" joinstyle="miter"/>
+                  <v:path arrowok="t" textboxrect="0,0,114300,0"/>
                 </v:shape>
-                <v:shape id="Shape 248" style="position:absolute;width:0;height:1143;left:47066;top:395;" coordsize="0,114300" path="m0,114300l0,0">
-                  <v:stroke weight="1pt" endcap="flat" joinstyle="miter" miterlimit="10" on="true" color="#000000"/>
-                  <v:fill on="false" color="#000000" opacity="0"/>
+                <v:shape id="Shape 248" o:spid="_x0000_s1042" style="position:absolute;left:47066;top:395;width:0;height:1143;visibility:visible;mso-wrap-style:square;v-text-anchor:top" coordsize="0,114300" o:gfxdata="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" path="m,114300l,e" filled="f" strokeweight="1pt">
+                  <v:stroke miterlimit="83231f" joinstyle="miter"/>
+                  <v:path arrowok="t" textboxrect="0,0,0,114300"/>
                 </v:shape>
+                <w10:anchorlock/>
               </v:group>
             </w:pict>
           </mc:Fallback>
@@ -4838,7 +4747,6 @@
         <w:rPr>
           <w:noProof/>
         </w:rPr>
-        <w:lastRenderedPageBreak/>
         <mc:AlternateContent>
           <mc:Choice Requires="wpg">
             <w:drawing>

</xml_diff>